<commit_message>
Added some references to the bibliography and updated the document with recent sources.
</commit_message>
<xml_diff>
--- a/03_Literature_Review/Final year project bibliography.docx
+++ b/03_Literature_Review/Final year project bibliography.docx
@@ -18,9 +18,218 @@
       <w:r>
         <w:t xml:space="preserve">The introduction of cold chain storage in Kiambu and its potential impact. </w:t>
       </w:r>
-      <w:r>
-        <w:t>https://acts-net.org/how-cold-chain-solutions-are-set-to-transform-smallholder-farmers-fortunes-in-kenya/</w:t>
-      </w:r>
+      <w:hyperlink r:id="rId5" w:history="1">
+        <w:r>
+          <w:rPr>
+            <w:rStyle w:val="Hyperlink"/>
+          </w:rPr>
+          <w:t>https://acts-net.org/how-cold-chain-solutions-are-set-to-transform-smallholder-farmers-fortunes-in-kenya/</w:t>
+        </w:r>
+      </w:hyperlink>
+    </w:p>
+    <w:p>
+      <w:pPr>
+        <w:pStyle w:val="ListParagraph"/>
+        <w:numPr>
+          <w:ilvl w:val="0"/>
+          <w:numId w:val="1"/>
+        </w:numPr>
+      </w:pPr>
+      <w:r>
+        <w:t>The Reality of cold chain technology in Kenya today:</w:t>
+      </w:r>
+      <w:r>
+        <w:br/>
+      </w:r>
+      <w:r>
+        <w:rPr>
+          <w:b/>
+          <w:bCs/>
+        </w:rPr>
+        <w:t>Cold Chain Logistics in Kenya: How Temperature-Controlled Supply Chains Are Transforming Agriculture, Healthcare, and Trade</w:t>
+      </w:r>
+      <w:r>
+        <w:rPr>
+          <w:b/>
+          <w:bCs/>
+        </w:rPr>
+        <w:t xml:space="preserve"> - </w:t>
+      </w:r>
+      <w:r>
+        <w:t>https://hudumaglobal.com/blog/cold-chain-logistics-kenya-temperature-controlled-supply-chains-agriculture-health</w:t>
+      </w:r>
+    </w:p>
+    <w:p>
+      <w:pPr>
+        <w:pStyle w:val="ListParagraph"/>
+        <w:numPr>
+          <w:ilvl w:val="0"/>
+          <w:numId w:val="1"/>
+        </w:numPr>
+        <w:rPr>
+          <w:b/>
+          <w:bCs/>
+        </w:rPr>
+      </w:pPr>
+      <w:r>
+        <w:t xml:space="preserve">Kenya’s Horticultural Export industry. How many people it employs and its impact on the national economy. </w:t>
+      </w:r>
+      <w:r>
+        <w:rPr>
+          <w:b/>
+          <w:bCs/>
+        </w:rPr>
+        <w:t>Kenya's Horticulture Industry: How Flowers, Fruits, and Vegetables Became a Multi-</w:t>
+      </w:r>
+      <w:r>
+        <w:rPr>
+          <w:b/>
+          <w:bCs/>
+        </w:rPr>
+        <w:t>Billion-Shilling</w:t>
+      </w:r>
+      <w:r>
+        <w:rPr>
+          <w:b/>
+          <w:bCs/>
+        </w:rPr>
+        <w:t xml:space="preserve"> Export Sector</w:t>
+      </w:r>
+      <w:r>
+        <w:rPr>
+          <w:b/>
+          <w:bCs/>
+        </w:rPr>
+        <w:t xml:space="preserve"> - </w:t>
+      </w:r>
+      <w:r>
+        <w:t>https://hudumaglobal.com/blog/kenya-horticulture-industry-flowers-fruits-vegetables-multi-billion-export-sector</w:t>
+      </w:r>
+    </w:p>
+    <w:p>
+      <w:pPr>
+        <w:pStyle w:val="ListParagraph"/>
+        <w:numPr>
+          <w:ilvl w:val="0"/>
+          <w:numId w:val="1"/>
+        </w:numPr>
+      </w:pPr>
+      <w:r>
+        <w:t xml:space="preserve">Everything you need to know about Kenya’s flower export industry, from production to compliance, is all here: </w:t>
+      </w:r>
+      <w:hyperlink r:id="rId6" w:history="1">
+        <w:r>
+          <w:rPr>
+            <w:rStyle w:val="Hyperlink"/>
+          </w:rPr>
+          <w:t>https://agrosocialservices.co.ke/certification-compliance/kenya-cut-flower-export/</w:t>
+        </w:r>
+      </w:hyperlink>
+    </w:p>
+    <w:p>
+      <w:pPr>
+        <w:pStyle w:val="ListParagraph"/>
+        <w:numPr>
+          <w:ilvl w:val="0"/>
+          <w:numId w:val="1"/>
+        </w:numPr>
+      </w:pPr>
+      <w:r>
+        <w:t xml:space="preserve">The same as in (4) above goes for the French beans: </w:t>
+      </w:r>
+      <w:hyperlink r:id="rId7" w:history="1">
+        <w:r>
+          <w:rPr>
+            <w:rStyle w:val="Hyperlink"/>
+          </w:rPr>
+          <w:t>https://agrosocialservices.co.ke/french-beans-export-kenya/</w:t>
+        </w:r>
+      </w:hyperlink>
+    </w:p>
+    <w:p>
+      <w:pPr>
+        <w:pStyle w:val="ListParagraph"/>
+        <w:numPr>
+          <w:ilvl w:val="0"/>
+          <w:numId w:val="1"/>
+        </w:numPr>
+      </w:pPr>
+      <w:r>
+        <w:t xml:space="preserve">Flower Cold chain conditions - </w:t>
+      </w:r>
+      <w:hyperlink r:id="rId8" w:history="1">
+        <w:r>
+          <w:rPr>
+            <w:rStyle w:val="Hyperlink"/>
+          </w:rPr>
+          <w:t>Kenyan Flower Logistics — cold chain, air and ocean transport, sustainability standards | Cargo Flowers - Cargo Flowers</w:t>
+        </w:r>
+      </w:hyperlink>
+    </w:p>
+    <w:p>
+      <w:pPr>
+        <w:pStyle w:val="ListParagraph"/>
+        <w:numPr>
+          <w:ilvl w:val="0"/>
+          <w:numId w:val="1"/>
+        </w:numPr>
+      </w:pPr>
+      <w:r>
+        <w:t xml:space="preserve">Where is all the Kenyan food? An article on the wastage happening in Kenya's food industry and the interventions underway. </w:t>
+      </w:r>
+      <w:hyperlink r:id="rId9" w:history="1">
+        <w:r>
+          <w:rPr>
+            <w:rStyle w:val="Hyperlink"/>
+          </w:rPr>
+          <w:t>https://africa.wri.org/insights/turning-tap-food-loss-and-waste-kenya</w:t>
+        </w:r>
+      </w:hyperlink>
+    </w:p>
+    <w:p>
+      <w:pPr>
+        <w:pStyle w:val="ListParagraph"/>
+        <w:numPr>
+          <w:ilvl w:val="0"/>
+          <w:numId w:val="1"/>
+        </w:numPr>
+        <w:spacing w:before="100" w:beforeAutospacing="1" w:after="100" w:afterAutospacing="1" w:line="240" w:lineRule="auto"/>
+        <w:outlineLvl w:val="0"/>
+        <w:rPr>
+          <w:rFonts w:eastAsia="Times New Roman" w:cstheme="minorHAnsi"/>
+          <w:kern w:val="36"/>
+          <w14:ligatures w14:val="none"/>
+        </w:rPr>
+      </w:pPr>
+      <w:r>
+        <w:rPr>
+          <w:rFonts w:eastAsia="Times New Roman" w:cstheme="minorHAnsi"/>
+          <w:kern w:val="36"/>
+          <w14:ligatures w14:val="none"/>
+        </w:rPr>
+        <w:t>Why Africa is Still Losing Millions of Tons of Fresh Produce in 2026</w:t>
+      </w:r>
+      <w:r>
+        <w:rPr>
+          <w:rFonts w:eastAsia="Times New Roman" w:cstheme="minorHAnsi"/>
+          <w:kern w:val="36"/>
+          <w14:ligatures w14:val="none"/>
+        </w:rPr>
+        <w:t xml:space="preserve"> - </w:t>
+      </w:r>
+      <w:r>
+        <w:rPr>
+          <w:rFonts w:eastAsia="Times New Roman" w:cstheme="minorHAnsi"/>
+          <w:kern w:val="36"/>
+          <w14:ligatures w14:val="none"/>
+        </w:rPr>
+        <w:t>https://www.inspirafarms.com/why-africa-is-still-losing-millions-of-tons-of-fresh-produce-in-2026-and-how-cold-chain-innovation-can-change-that/</w:t>
+      </w:r>
+    </w:p>
+    <w:p>
+      <w:pPr>
+        <w:ind w:left="360"/>
+      </w:pPr>
     </w:p>
     <w:sectPr>
       <w:pgSz w:w="11906" w:h="16838"/>
@@ -732,7 +941,6 @@
   <w:style w:type="character" w:default="1" w:styleId="DefaultParagraphFont">
     <w:name w:val="Default Paragraph Font"/>
     <w:uiPriority w:val="1"/>
-    <w:semiHidden/>
     <w:unhideWhenUsed/>
   </w:style>
   <w:style w:type="table" w:default="1" w:styleId="TableNormal">
@@ -1044,6 +1252,29 @@
       <w:smallCaps/>
       <w:color w:val="2F5496" w:themeColor="accent1" w:themeShade="BF"/>
       <w:spacing w:val="5"/>
+    </w:rPr>
+  </w:style>
+  <w:style w:type="character" w:styleId="Hyperlink">
+    <w:name w:val="Hyperlink"/>
+    <w:basedOn w:val="DefaultParagraphFont"/>
+    <w:uiPriority w:val="99"/>
+    <w:unhideWhenUsed/>
+    <w:rsid w:val="00D41828"/>
+    <w:rPr>
+      <w:color w:val="0563C1" w:themeColor="hyperlink"/>
+      <w:u w:val="single"/>
+    </w:rPr>
+  </w:style>
+  <w:style w:type="character" w:styleId="UnresolvedMention">
+    <w:name w:val="Unresolved Mention"/>
+    <w:basedOn w:val="DefaultParagraphFont"/>
+    <w:uiPriority w:val="99"/>
+    <w:semiHidden/>
+    <w:unhideWhenUsed/>
+    <w:rsid w:val="00D41828"/>
+    <w:rPr>
+      <w:color w:val="605E5C"/>
+      <w:shd w:val="clear" w:color="auto" w:fill="E1DFDD"/>
     </w:rPr>
   </w:style>
 </w:styles>

</xml_diff>